<commit_message>
Daytime QA, clause fills, dedupe, washing calculator
</commit_message>
<xml_diff>
--- a/Jamieson-Ops/sales/Jamieson - PM Portfolio Agreement.docx
+++ b/Jamieson-Ops/sales/Jamieson - PM Portfolio Agreement.docx
@@ -1559,7 +1559,7 @@
           <w:color w:val="1D2733"/>
           <w:sz w:val="20"/>
         </w:rPr>
-        <w:t>If Client installs fewer Doors than the committed count in Section 1 during the Term, Provider may re-price the installed Doors at the tier corresponding to the actual count, and invoice the difference. [Confirm mechanism with attorney.]</w:t>
+        <w:t>If Client installs fewer Doors than the committed count in Section 1 during the Term, Provider may re-price the installed Doors at the tier corresponding to the actual count, and invoice the difference.</w:t>
       </w:r>
     </w:p>
     <w:p>
@@ -1805,7 +1805,7 @@
           <w:color w:val="1D2733"/>
           <w:sz w:val="20"/>
         </w:rPr>
-        <w:t>Invoices are due [net 15] from completion of each Door. Late balances may accrue [__]% interest per month. [Confirm rate/legality with attorney.]</w:t>
+        <w:t>Invoices are due Net 15 from completion of each Door. Late balances may accrue interest at 1.5% per month (18% per annum) on the unpaid amount.</w:t>
       </w:r>
     </w:p>
     <w:p>
@@ -2016,7 +2016,7 @@
           <w:color w:val="1D2733"/>
           <w:sz w:val="20"/>
         </w:rPr>
-        <w:t>Warranty excludes damage from misuse, tampering, power events, acts of nature, third-party changes, or loss of internet/Starlink service outside Provider’s control. [Attorney to finalize.]</w:t>
+        <w:t>Warranty excludes damage from misuse, tampering, power events, acts of nature, third-party changes, or loss of internet/Starlink service outside Provider’s control.</w:t>
       </w:r>
     </w:p>
     <w:p>
@@ -2174,7 +2174,7 @@
           <w:color w:val="1D2733"/>
           <w:sz w:val="20"/>
         </w:rPr>
-        <w:t>Provider’s total liability under this Agreement is limited to [the amounts paid for the affected Door]. Provider is not liable for indirect or consequential damages. [Attorney to finalize—critical clause.]</w:t>
+        <w:t>Provider’s total liability under this Agreement is limited to the amounts paid for the affected Door. Provider is not liable for indirect, incidental, or consequential damages.</w:t>
       </w:r>
     </w:p>
     <w:p>
@@ -2209,7 +2209,7 @@
           <w:color w:val="1D2733"/>
           <w:sz w:val="20"/>
         </w:rPr>
-        <w:t>Provider maintains [general liability] insurance and will provide a certificate on request. [Confirm coverage.]</w:t>
+        <w:t>Provider maintains commercial general liability insurance and will provide a certificate of insurance on request. [ACTION REQUIRED — Ray: keep this clause only if you actually carry commercial general liability insurance; if not, delete this sentence before use.]</w:t>
       </w:r>
     </w:p>
     <w:p>
@@ -2279,7 +2279,7 @@
           <w:color w:val="1D2733"/>
           <w:sz w:val="20"/>
         </w:rPr>
-        <w:t>This Agreement is governed by the laws of the State of North Carolina. [Venue/dispute-resolution clause to be added by attorney.]</w:t>
+        <w:t>This Agreement is governed by the laws of the State of North Carolina. Any dispute shall be brought exclusively in the state or federal courts located in Dare County, North Carolina, and both parties consent to that venue.</w:t>
       </w:r>
     </w:p>
     <w:p>

</xml_diff>